<commit_message>
docs: fix Polish characters in user manual
</commit_message>
<xml_diff>
--- a/docs/Instrukcja_Photo_Local.docx
+++ b/docs/Instrukcja_Photo_Local.docx
@@ -14,7 +14,7 @@
         </w:rPr>
         <w:t>Photo Local</w:t>
         <w:br/>
-        <w:t>Instrukcja obs?ugi</w:t>
+        <w:t>Instrukcja obsługi</w:t>
       </w:r>
     </w:p>
     <w:p>
@@ -26,7 +26,7 @@
           <w:color w:val="6B7280"/>
           <w:sz w:val="24"/>
         </w:rPr>
-        <w:t>Wersja dla u?ytkownika nietechnicznego | aktualizacja: 14.05.2026</w:t>
+        <w:t>Wersja dla użytkownika nietechnicznego | aktualizacja: 14.05.2026</w:t>
       </w:r>
     </w:p>
     <w:p>
@@ -42,7 +42,7 @@
               <a:graphicData uri="http://schemas.openxmlformats.org/drawingml/2006/picture">
                 <pic:pic>
                   <pic:nvPicPr>
-                    <pic:cNvPr id="0" name="photo-local-przeplyw.png"/>
+                    <pic:cNvPr id="0" name="przeplyw.png"/>
                     <pic:cNvPicPr/>
                   </pic:nvPicPr>
                   <pic:blipFill>
@@ -68,7 +68,6 @@
     <w:tbl>
       <w:tblPr>
         <w:tblW w:type="auto" w:w="0"/>
-        <w:tblLayout w:type="autofit"/>
         <w:tblLook w:firstColumn="1" w:firstRow="1" w:lastColumn="0" w:lastRow="0" w:noHBand="0" w:noVBand="1" w:val="04A0"/>
       </w:tblPr>
       <w:tblGrid>
@@ -86,11 +85,11 @@
                 <w:b/>
                 <w:color w:val="2563EB"/>
               </w:rPr>
-              <w:t>W skr?cie</w:t>
+              <w:t>W skrócie</w:t>
             </w:r>
             <w:r>
               <w:br/>
-              <w:t>Program tworzy checklist? zdj?? z pliku GPKG, pobiera zdj?cia z Google Chat, pomaga je rozpozna? lokalnym modelem Qwen i pozwala zatwierdzi? albo poprawi? paczki zdj?? przed finalnym importem.</w:t>
+              <w:t>Program tworzy checklistę zdjęć z pliku GPKG, pobiera zdjęcia z Google Chat, pomaga je rozpoznać lokalnym modelem Qwen i pozwala zatwierdzić albo poprawić paczki zdjęć przed finalnym importem.</w:t>
             </w:r>
           </w:p>
         </w:tc>
@@ -105,15 +104,14 @@
     <w:p>
       <w:pPr>
         <w:pStyle w:val="Heading1"/>
-        <w:spacing w:before="200" w:after="100"/>
       </w:pPr>
       <w:r>
-        <w:t>1. Do czego s?u?y Photo Local</w:t>
+        <w:t>1. Do czego służy Photo Local</w:t>
       </w:r>
     </w:p>
     <w:p>
       <w:r>
-        <w:t>Photo Local jest miejscem, w kt?rym prowadzimy komplet zdj?? dla projektu. Aplikacja ma pokaza?, kt?re zdj?cia s? ju? przypisane do checklisty, czego brakuje oraz kt?re paczki wymagaj? r?cznego sprawdzenia.</w:t>
+        <w:t>Photo Local jest miejscem, w którym prowadzimy komplet zdjęć dla projektu. Aplikacja ma pokazać, które zdjęcia są już przypisane do checklisty, czego brakuje oraz które paczki wymagają ręcznego sprawdzenia.</w:t>
       </w:r>
     </w:p>
     <w:p>
@@ -121,7 +119,7 @@
         <w:pStyle w:val="ListBullet"/>
       </w:pPr>
       <w:r>
-        <w:t>GPKG tworzy checklist? wymaganych punkt?w i folder?w.</w:t>
+        <w:t>GPKG tworzy checklistę wymaganych punktów i folderów.</w:t>
       </w:r>
     </w:p>
     <w:p>
@@ -129,7 +127,7 @@
         <w:pStyle w:val="ListBullet"/>
       </w:pPr>
       <w:r>
-        <w:t>Google Chat dostarcza paczki zdj?? od ekip budowlanych.</w:t>
+        <w:t>Google Chat dostarcza paczki zdjęć od ekip budowlanych.</w:t>
       </w:r>
     </w:p>
     <w:p>
@@ -137,7 +135,7 @@
         <w:pStyle w:val="ListBullet"/>
       </w:pPr>
       <w:r>
-        <w:t>Qwen lokalnie ogl?da zdj?cia i proponuje przypisanie.</w:t>
+        <w:t>Qwen lokalnie ogląda zdjęcia i proponuje przypisanie.</w:t>
       </w:r>
     </w:p>
     <w:p>
@@ -145,16 +143,15 @@
         <w:pStyle w:val="ListBullet"/>
       </w:pPr>
       <w:r>
-        <w:t>U?ytkownik zatwierdza pewne paczki albo poprawia niepewne w Review.</w:t>
+        <w:t>Użytkownik zatwierdza pewne paczki albo poprawia niepewne w Review.</w:t>
       </w:r>
     </w:p>
     <w:p>
       <w:pPr>
         <w:pStyle w:val="Heading1"/>
-        <w:spacing w:before="200" w:after="100"/>
       </w:pPr>
       <w:r>
-        <w:t>2. Strona g??wna i wyszukiwanie</w:t>
+        <w:t>2. Strona główna i wyszukiwanie</w:t>
       </w:r>
     </w:p>
     <w:p>
@@ -162,7 +159,7 @@
         <w:pStyle w:val="ListBullet"/>
       </w:pPr>
       <w:r>
-        <w:t>Po wej?ciu do aplikacji wida? list? projekt?w.</w:t>
+        <w:t>Po wejściu do aplikacji widać listę projektów.</w:t>
       </w:r>
     </w:p>
     <w:p>
@@ -170,7 +167,7 @@
         <w:pStyle w:val="ListBullet"/>
       </w:pPr>
       <w:r>
-        <w:t>Wyszukiwarka nad list? pozwala znale?? projekt po definicji, nazwie albo pliku GPKG.</w:t>
+        <w:t>Wyszukiwarka nad listą pozwala znaleźć projekt po definicji, nazwie albo pliku GPKG.</w:t>
       </w:r>
     </w:p>
     <w:p>
@@ -178,7 +175,7 @@
         <w:pStyle w:val="ListBullet"/>
       </w:pPr>
       <w:r>
-        <w:t>Klikni?cie logo Photo Local w lewym g?rnym rogu wraca na stron? g??wn?.</w:t>
+        <w:t>Kliknięcie logo Photo Local w lewym górnym rogu wraca na stronę główną.</w:t>
       </w:r>
     </w:p>
     <w:p>
@@ -186,13 +183,12 @@
         <w:pStyle w:val="ListBullet"/>
       </w:pPr>
       <w:r>
-        <w:t>Projekty s? podzielone na W trakcie i Uko?czone.</w:t>
+        <w:t>Projekty są podzielone na W trakcie i Ukończone.</w:t>
       </w:r>
     </w:p>
     <w:p>
       <w:pPr>
         <w:pStyle w:val="Heading1"/>
-        <w:spacing w:before="200" w:after="100"/>
       </w:pPr>
       <w:r>
         <w:t>3. Tworzenie projektu</w:t>
@@ -203,7 +199,7 @@
         <w:pStyle w:val="ListBullet"/>
       </w:pPr>
       <w:r>
-        <w:t>Kliknij Utw?rz zadanie.</w:t>
+        <w:t>Kliknij Utwórz zadanie.</w:t>
       </w:r>
     </w:p>
     <w:p>
@@ -219,7 +215,7 @@
         <w:pStyle w:val="ListBullet"/>
       </w:pPr>
       <w:r>
-        <w:t>Wybierz folder zapisu zdj?? na dysku udost?pnionym widocznym dla backendu.</w:t>
+        <w:t>Wybierz folder zapisu zdjęć na dysku udostępnionym widocznym dla backendu.</w:t>
       </w:r>
     </w:p>
     <w:p>
@@ -227,7 +223,7 @@
         <w:pStyle w:val="ListBullet"/>
       </w:pPr>
       <w:r>
-        <w:t>Je?eli potrzebujesz nowego folderu, wejd? do odpowiedniego miejsca, wpisz nazw? folderu i kliknij Utw?rz.</w:t>
+        <w:t>Jeżeli potrzebujesz nowego folderu, wejdź do odpowiedniego miejsca, wpisz nazwę folderu i kliknij Utwórz.</w:t>
       </w:r>
     </w:p>
     <w:p>
@@ -235,7 +231,7 @@
         <w:pStyle w:val="ListBullet"/>
       </w:pPr>
       <w:r>
-        <w:t>Kliknij U?yj tego folderu. ?cie?ka zostanie wpisana jako folder zapisu zdj??.</w:t>
+        <w:t>Kliknij Użyj tego folderu. Ścieżka zostanie wpisana jako folder zapisu zdjęć.</w:t>
       </w:r>
     </w:p>
     <w:p>
@@ -251,7 +247,7 @@
         <w:pStyle w:val="ListBullet"/>
       </w:pPr>
       <w:r>
-        <w:t>Wybierz topologi? splitter?w. Najcz??ciej zostaw Wykryj z GPKG.</w:t>
+        <w:t>Wybierz topologię splitterów. Najczęściej zostaw Wykryj z GPKG.</w:t>
       </w:r>
     </w:p>
     <w:p>
@@ -259,13 +255,12 @@
         <w:pStyle w:val="ListBullet"/>
       </w:pPr>
       <w:r>
-        <w:t>Kliknij Utw?rz.</w:t>
+        <w:t>Kliknij Utwórz.</w:t>
       </w:r>
     </w:p>
     <w:tbl>
       <w:tblPr>
         <w:tblW w:type="auto" w:w="0"/>
-        <w:tblLayout w:type="autofit"/>
         <w:tblLook w:firstColumn="1" w:firstRow="1" w:lastColumn="0" w:lastRow="0" w:noHBand="0" w:noVBand="1" w:val="04A0"/>
       </w:tblPr>
       <w:tblGrid>
@@ -283,11 +278,11 @@
                 <w:b/>
                 <w:color w:val="2563EB"/>
               </w:rPr>
-              <w:t>Wa?ne o dyskach</w:t>
+              <w:t>Ważne o dyskach</w:t>
             </w:r>
             <w:r>
               <w:br/>
-              <w:t>Zdj?cia zapisuje komputer, na kt?rym dzia?a backend. Dlatego folder musi by? widoczny dla backendu. Najlepiej u?ywa? zmapowanego dysku udost?pnionego, np. Z:\ lub udzia?u sieciowego. Je?li folder jest tylko lokalnie na drugim komputerze i nie jest udost?pniony, backend go nie zobaczy.</w:t>
+              <w:t>Zdjęcia zapisuje komputer, na którym działa backend. Dlatego folder musi być widoczny dla backendu. Najlepiej używać zmapowanego dysku udostępnionego, np. Z:\ albo udziału sieciowego. Jeśli folder jest tylko lokalnie na drugim komputerze i nie jest udostępniony, backend go nie zobaczy.</w:t>
             </w:r>
           </w:p>
         </w:tc>
@@ -307,7 +302,7 @@
               <a:graphicData uri="http://schemas.openxmlformats.org/drawingml/2006/picture">
                 <pic:pic>
                   <pic:nvPicPr>
-                    <pic:cNvPr id="0" name="photo-local-folder-zapisu.png"/>
+                    <pic:cNvPr id="0" name="folder-zapisu.png"/>
                     <pic:cNvPicPr/>
                   </pic:nvPicPr>
                   <pic:blipFill>
@@ -333,10 +328,9 @@
     <w:p>
       <w:pPr>
         <w:pStyle w:val="Heading1"/>
-        <w:spacing w:before="200" w:after="100"/>
       </w:pPr>
       <w:r>
-        <w:t>4. Pobieranie zdj?? z Google Chat</w:t>
+        <w:t>4. Pobieranie zdjęć z Google Chat</w:t>
       </w:r>
     </w:p>
     <w:p>
@@ -344,7 +338,7 @@
         <w:pStyle w:val="ListBullet"/>
       </w:pPr>
       <w:r>
-        <w:t>Wejd? w projekt i otw?rz zak?adk? Import z Google Chat.</w:t>
+        <w:t>Wejdź w projekt i otwórz zakładkę Import z Google Chat.</w:t>
       </w:r>
     </w:p>
     <w:p>
@@ -352,7 +346,7 @@
         <w:pStyle w:val="ListBullet"/>
       </w:pPr>
       <w:r>
-        <w:t>Kliknij Otw?rz logowanie, je?li konto bota wymaga zalogowania.</w:t>
+        <w:t>Kliknij Otwórz logowanie, jeśli konto bota wymaga zalogowania.</w:t>
       </w:r>
     </w:p>
     <w:p>
@@ -360,7 +354,7 @@
         <w:pStyle w:val="ListBullet"/>
       </w:pPr>
       <w:r>
-        <w:t>Status Sesja aktywna oznacza, ?e konto Google Chat dzia?a.</w:t>
+        <w:t>Status Sesja aktywna oznacza, że konto Google Chat działa.</w:t>
       </w:r>
     </w:p>
     <w:p>
@@ -368,7 +362,7 @@
         <w:pStyle w:val="ListBullet"/>
       </w:pPr>
       <w:r>
-        <w:t>Kliknij Za?aduj pokoje.</w:t>
+        <w:t>Kliknij Załaduj pokoje.</w:t>
       </w:r>
     </w:p>
     <w:p>
@@ -376,7 +370,7 @@
         <w:pStyle w:val="ListBullet"/>
       </w:pPr>
       <w:r>
-        <w:t>Wybierz odpowiedni pok?j Google Chat.</w:t>
+        <w:t>Wybierz odpowiedni pokój Google Chat.</w:t>
       </w:r>
     </w:p>
     <w:p>
@@ -384,13 +378,12 @@
         <w:pStyle w:val="ListBullet"/>
       </w:pPr>
       <w:r>
-        <w:t>Kliknij Pobierz zdj?cia.</w:t>
+        <w:t>Kliknij Pobierz zdjęcia.</w:t>
       </w:r>
     </w:p>
     <w:tbl>
       <w:tblPr>
         <w:tblW w:type="auto" w:w="0"/>
-        <w:tblLayout w:type="autofit"/>
         <w:tblLook w:firstColumn="1" w:firstRow="1" w:lastColumn="0" w:lastRow="0" w:noHBand="0" w:noVBand="1" w:val="04A0"/>
       </w:tblPr>
       <w:tblGrid>
@@ -412,7 +405,7 @@
             </w:r>
             <w:r>
               <w:br/>
-              <w:t>Program pobiera wiadomo?ci i zdj?cia z wybranego pokoju. Z jednej wiadomo?ci powstaje zwykle jedna paczka zdj??, np. opis Malenicka 5 i trzy zdj?cia tworz? jedn? paczk? dla Malenickiej 5.</w:t>
+              <w:t>Program pobiera wiadomości i zdjęcia z wybranego pokoju. Z jednej wiadomości powstaje zwykle jedna paczka zdjęć, np. opis Malenicka 5 i trzy zdjęcia tworzą jedną paczkę dla Malenickiej 5.</w:t>
             </w:r>
           </w:p>
         </w:tc>
@@ -422,10 +415,9 @@
     <w:p>
       <w:pPr>
         <w:pStyle w:val="Heading1"/>
-        <w:spacing w:before="200" w:after="100"/>
       </w:pPr>
       <w:r>
-        <w:t>5. Import paczek z pobranych zdj??</w:t>
+        <w:t>5. Import paczek z pobranych zdjęć</w:t>
       </w:r>
     </w:p>
     <w:p>
@@ -449,7 +441,7 @@
         <w:pStyle w:val="ListBullet"/>
       </w:pPr>
       <w:r>
-        <w:t>Paczki z normalnym opisem trafi? do weryfikacji Qwen.</w:t>
+        <w:t>Paczki z normalnym opisem trafią do weryfikacji Qwen.</w:t>
       </w:r>
     </w:p>
     <w:p>
@@ -457,13 +449,12 @@
         <w:pStyle w:val="ListBullet"/>
       </w:pPr>
       <w:r>
-        <w:t>Paczki bez opisu, z dziwnym opisem albo z kilkoma adresami mog? od razu trafi? do Review.</w:t>
+        <w:t>Paczki bez opisu, z dziwnym opisem albo z kilkoma adresami mogą od razu trafić do Review.</w:t>
       </w:r>
     </w:p>
     <w:p>
       <w:pPr>
         <w:pStyle w:val="Heading1"/>
-        <w:spacing w:before="200" w:after="100"/>
       </w:pPr>
       <w:r>
         <w:t>6. Weryfikacja Qwen</w:t>
@@ -482,7 +473,7 @@
         <w:pStyle w:val="ListBullet"/>
       </w:pPr>
       <w:r>
-        <w:t>Qwen analizuje ca?? paczk? zdj??, a nie tylko jedno zdj?cie.</w:t>
+        <w:t>Qwen analizuje całą paczkę zdjęć, a nie tylko jedno zdjęcie.</w:t>
       </w:r>
     </w:p>
     <w:p>
@@ -490,7 +481,7 @@
         <w:pStyle w:val="ListBullet"/>
       </w:pPr>
       <w:r>
-        <w:t>Model pr?buje rozpozna? punkt checklisty oraz typ zapasu.</w:t>
+        <w:t>Model próbuje rozpoznać punkt checklisty oraz typ zapasu.</w:t>
       </w:r>
     </w:p>
     <w:p>
@@ -498,7 +489,7 @@
         <w:pStyle w:val="ListBullet"/>
       </w:pPr>
       <w:r>
-        <w:t>Typy zapas?w to: Doziemny, W studni, Napowietrzny.</w:t>
+        <w:t>Typy zapasów to: Doziemny, W studni, Napowietrzny.</w:t>
       </w:r>
     </w:p>
     <w:p>
@@ -506,13 +497,12 @@
         <w:pStyle w:val="ListBullet"/>
       </w:pPr>
       <w:r>
-        <w:t>Wyniki pewne trafiaj? do Do importu. Wyniki niepewne trafiaj? do Review.</w:t>
+        <w:t>Wyniki pewne trafiają do Do importu. Wyniki niepewne trafiają do Review.</w:t>
       </w:r>
     </w:p>
     <w:tbl>
       <w:tblPr>
         <w:tblW w:type="auto" w:w="0"/>
-        <w:tblLayout w:type="autofit"/>
         <w:tblLook w:firstColumn="1" w:firstRow="1" w:lastColumn="0" w:lastRow="0" w:noHBand="0" w:noVBand="1" w:val="04A0"/>
       </w:tblPr>
       <w:tblGrid>
@@ -530,11 +520,11 @@
                 <w:b/>
                 <w:color w:val="2563EB"/>
               </w:rPr>
-              <w:t>Qwen nie jest wyroczni?</w:t>
+              <w:t>Qwen nie jest wyrocznią</w:t>
             </w:r>
             <w:r>
               <w:br/>
-              <w:t>Model przyspiesza prac?, ale nie ma zast?pi? cz?owieka w 100%. Je?eli ma w?tpliwo??, paczka powinna trafi? do Review.</w:t>
+              <w:t>Model przyspiesza pracę, ale nie ma zastąpić człowieka w 100%. Jeżeli ma wątpliwość, paczka powinna trafić do Review.</w:t>
             </w:r>
           </w:p>
         </w:tc>
@@ -544,10 +534,9 @@
     <w:p>
       <w:pPr>
         <w:pStyle w:val="Heading1"/>
-        <w:spacing w:before="200" w:after="100"/>
       </w:pPr>
       <w:r>
-        <w:t>7. Zak?adka Do importu</w:t>
+        <w:t>7. Zakładka Do importu</w:t>
       </w:r>
     </w:p>
     <w:p>
@@ -555,7 +544,7 @@
         <w:pStyle w:val="ListBullet"/>
       </w:pPr>
       <w:r>
-        <w:t>To miejsce dla paczek, kt?re aplikacja uzna?a za gotowe.</w:t>
+        <w:t>To miejsce dla paczek, które aplikacja uznała za gotowe.</w:t>
       </w:r>
     </w:p>
     <w:p>
@@ -563,7 +552,7 @@
         <w:pStyle w:val="ListBullet"/>
       </w:pPr>
       <w:r>
-        <w:t>Program ma ju? przypisany folder checklisty i ewentualny typ zapasu.</w:t>
+        <w:t>Program ma już przypisany folder checklisty i ewentualny typ zapasu.</w:t>
       </w:r>
     </w:p>
     <w:p>
@@ -571,7 +560,7 @@
         <w:pStyle w:val="ListBullet"/>
       </w:pPr>
       <w:r>
-        <w:t>Przed importem mo?na szybko przejrze?, czy wszystko wygl?da logicznie.</w:t>
+        <w:t>Przed importem można szybko przejrzeć, czy wszystko wygląda logicznie.</w:t>
       </w:r>
     </w:p>
     <w:p>
@@ -579,16 +568,15 @@
         <w:pStyle w:val="ListBullet"/>
       </w:pPr>
       <w:r>
-        <w:t>Po zatwierdzeniu zdj?cia trafiaj? do w?a?ciwych folder?w checklisty.</w:t>
+        <w:t>Po zatwierdzeniu zdjęcia trafiają do właściwych folderów checklisty.</w:t>
       </w:r>
     </w:p>
     <w:p>
       <w:pPr>
         <w:pStyle w:val="Heading1"/>
-        <w:spacing w:before="200" w:after="100"/>
       </w:pPr>
       <w:r>
-        <w:t>8. Zak?adka Review</w:t>
+        <w:t>8. Zakładka Review</w:t>
       </w:r>
     </w:p>
     <w:p>
@@ -604,7 +592,7 @@
               <a:graphicData uri="http://schemas.openxmlformats.org/drawingml/2006/picture">
                 <pic:pic>
                   <pic:nvPicPr>
-                    <pic:cNvPr id="0" name="photo-local-review.png"/>
+                    <pic:cNvPr id="0" name="review.png"/>
                     <pic:cNvPicPr/>
                   </pic:nvPicPr>
                   <pic:blipFill>
@@ -632,7 +620,7 @@
         <w:pStyle w:val="ListBullet"/>
       </w:pPr>
       <w:r>
-        <w:t>Review s?u?y do r?cznego sprawdzania paczek niepewnych.</w:t>
+        <w:t>Review służy do ręcznego sprawdzania paczek niepewnych.</w:t>
       </w:r>
     </w:p>
     <w:p>
@@ -640,7 +628,7 @@
         <w:pStyle w:val="ListBullet"/>
       </w:pPr>
       <w:r>
-        <w:t>Trafiaj? tu paczki bez opisu, z liter?wkami, z kilkoma adresami albo z niepewnym typem zdj?cia.</w:t>
+        <w:t>Trafiają tu paczki bez opisu, z literówkami, z kilkoma adresami albo z niepewnym typem zdjęcia.</w:t>
       </w:r>
     </w:p>
     <w:p>
@@ -648,7 +636,7 @@
         <w:pStyle w:val="ListBullet"/>
       </w:pPr>
       <w:r>
-        <w:t>Mo?na wybra? w?a?ciwy folder checklisty z wyszukiwarki.</w:t>
+        <w:t>Można wybrać właściwy folder checklisty z wyszukiwarki.</w:t>
       </w:r>
     </w:p>
     <w:p>
@@ -656,7 +644,7 @@
         <w:pStyle w:val="ListBullet"/>
       </w:pPr>
       <w:r>
-        <w:t>Mo?na wybra? typ zapasu: Doziemny, W studni albo Napowietrzny.</w:t>
+        <w:t>Można wybrać typ zapasu: Doziemny, W studni albo Napowietrzny.</w:t>
       </w:r>
     </w:p>
     <w:p>
@@ -664,7 +652,7 @@
         <w:pStyle w:val="ListBullet"/>
       </w:pPr>
       <w:r>
-        <w:t>Mo?na odznaczy? pojedyncze zdj?cia, kt?rych nie chcemy importowa?.</w:t>
+        <w:t>Można odznaczyć pojedyncze zdjęcia, których nie chcemy importować.</w:t>
       </w:r>
     </w:p>
     <w:p>
@@ -672,13 +660,12 @@
         <w:pStyle w:val="ListBullet"/>
       </w:pPr>
       <w:r>
-        <w:t>Mo?na odrzuci? ca?? paczk?, je?li zdj?cia nie s? potrzebne dla inwestora.</w:t>
+        <w:t>Można odrzucić całą paczkę, jeśli zdjęcia nie są potrzebne dla inwestora.</w:t>
       </w:r>
     </w:p>
     <w:p>
       <w:pPr>
         <w:pStyle w:val="Heading1"/>
-        <w:spacing w:before="200" w:after="100"/>
       </w:pPr>
       <w:r>
         <w:t>9. Braki i checklista</w:t>
@@ -689,7 +676,7 @@
         <w:pStyle w:val="ListBullet"/>
       </w:pPr>
       <w:r>
-        <w:t>Zak?adka Zdj?cia pokazuje struktur? checklisty i przypisane zdj?cia.</w:t>
+        <w:t>Zakładka Zdjęcia pokazuje strukturę checklisty i przypisane zdjęcia.</w:t>
       </w:r>
     </w:p>
     <w:p>
@@ -697,7 +684,7 @@
         <w:pStyle w:val="ListBullet"/>
       </w:pPr>
       <w:r>
-        <w:t>Zak?adka Braki pokazuje punkty, kt?re nadal wymagaj? zdj??.</w:t>
+        <w:t>Zakładka Braki pokazuje punkty, które nadal wymagają zdjęć.</w:t>
       </w:r>
     </w:p>
     <w:p>
@@ -705,7 +692,7 @@
         <w:pStyle w:val="ListBullet"/>
       </w:pPr>
       <w:r>
-        <w:t>Je?eli zdj?cie przysz?o poza Google Chat, mo?na doda? je r?cznie w odpowiednim punkcie checklisty.</w:t>
+        <w:t>Jeżeli zdjęcie przyszło poza Google Chat, można dodać je ręcznie w odpowiednim punkcie checklisty.</w:t>
       </w:r>
     </w:p>
     <w:p>
@@ -713,16 +700,15 @@
         <w:pStyle w:val="ListBullet"/>
       </w:pPr>
       <w:r>
-        <w:t>Na ko?cu projektu warto przej?? Braki i Review, zanim uznamy projekt za gotowy.</w:t>
+        <w:t>Na końcu projektu warto przejść Braki i Review, zanim uznamy projekt za gotowy.</w:t>
       </w:r>
     </w:p>
     <w:p>
       <w:pPr>
         <w:pStyle w:val="Heading1"/>
-        <w:spacing w:before="200" w:after="100"/>
       </w:pPr>
       <w:r>
-        <w:t>10. Najcz?stsze sytuacje</w:t>
+        <w:t>10. Najczęstsze sytuacje</w:t>
       </w:r>
     </w:p>
     <w:tbl>
@@ -743,9 +729,6 @@
             <w:vAlign w:val="center"/>
           </w:tcPr>
           <w:p>
-            <w:pPr>
-              <w:spacing w:after="40"/>
-            </w:pPr>
             <w:r>
               <w:t>Sytuacja</w:t>
             </w:r>
@@ -758,11 +741,8 @@
             <w:vAlign w:val="center"/>
           </w:tcPr>
           <w:p>
-            <w:pPr>
-              <w:spacing w:after="40"/>
-            </w:pPr>
             <w:r>
-              <w:t>Co zrobi?</w:t>
+              <w:t>Co zrobić</w:t>
             </w:r>
           </w:p>
         </w:tc>
@@ -774,11 +754,8 @@
             <w:vAlign w:val="center"/>
           </w:tcPr>
           <w:p>
-            <w:pPr>
-              <w:spacing w:after="40"/>
-            </w:pPr>
             <w:r>
-              <w:t>Nie widz? dysku Z: w tworzeniu projektu</w:t>
+              <w:t>Nie widzę dysku Z: w tworzeniu projektu</w:t>
             </w:r>
           </w:p>
         </w:tc>
@@ -788,11 +765,8 @@
             <w:vAlign w:val="center"/>
           </w:tcPr>
           <w:p>
-            <w:pPr>
-              <w:spacing w:after="40"/>
-            </w:pPr>
             <w:r>
-              <w:t>Sprawd? na komputerze z backendem, czy dysk jest zmapowany i dost?pny.</w:t>
+              <w:t>Sprawdź na komputerze z backendem, czy dysk jest zmapowany i dostępny.</w:t>
             </w:r>
           </w:p>
         </w:tc>
@@ -804,11 +778,8 @@
             <w:vAlign w:val="center"/>
           </w:tcPr>
           <w:p>
-            <w:pPr>
-              <w:spacing w:after="40"/>
-            </w:pPr>
             <w:r>
-              <w:t>Chc? zapisa? zdj?cia na komputerze innej osoby</w:t>
+              <w:t>Chcę zapisać zdjęcia na komputerze innej osoby</w:t>
             </w:r>
           </w:p>
         </w:tc>
@@ -818,11 +789,8 @@
             <w:vAlign w:val="center"/>
           </w:tcPr>
           <w:p>
-            <w:pPr>
-              <w:spacing w:after="40"/>
-            </w:pPr>
             <w:r>
-              <w:t>Ten folder musi by? udost?pniony w sieci i widoczny dla backendu.</w:t>
+              <w:t>Ten folder musi być udostępniony w sieci i widoczny dla backendu.</w:t>
             </w:r>
           </w:p>
         </w:tc>
@@ -834,11 +802,8 @@
             <w:vAlign w:val="center"/>
           </w:tcPr>
           <w:p>
-            <w:pPr>
-              <w:spacing w:after="40"/>
-            </w:pPr>
             <w:r>
-              <w:t>Ekipa wrzuci?a kilka adres?w w jednej wiadomo?ci</w:t>
+              <w:t>Ekipa wrzuciła kilka adresów w jednej wiadomości</w:t>
             </w:r>
           </w:p>
         </w:tc>
@@ -848,11 +813,8 @@
             <w:vAlign w:val="center"/>
           </w:tcPr>
           <w:p>
-            <w:pPr>
-              <w:spacing w:after="40"/>
-            </w:pPr>
             <w:r>
-              <w:t>Paczka powinna trafi? do Review. Tam cz?owiek wybiera w?a?ciwe przypisanie.</w:t>
+              <w:t>Paczka powinna trafić do Review. Tam człowiek wybiera właściwe przypisanie.</w:t>
             </w:r>
           </w:p>
         </w:tc>
@@ -864,11 +826,8 @@
             <w:vAlign w:val="center"/>
           </w:tcPr>
           <w:p>
-            <w:pPr>
-              <w:spacing w:after="40"/>
-            </w:pPr>
             <w:r>
-              <w:t>Qwen pomyli? typ zapasu</w:t>
+              <w:t>Qwen pomylił typ zapasu</w:t>
             </w:r>
           </w:p>
         </w:tc>
@@ -878,11 +837,8 @@
             <w:vAlign w:val="center"/>
           </w:tcPr>
           <w:p>
-            <w:pPr>
-              <w:spacing w:after="40"/>
-            </w:pPr>
             <w:r>
-              <w:t>Popraw r?cznie w Review albo w podgl?dzie zdj??.</w:t>
+              <w:t>Popraw ręcznie w Review albo w podglądzie zdjęć.</w:t>
             </w:r>
           </w:p>
         </w:tc>
@@ -894,11 +850,8 @@
             <w:vAlign w:val="center"/>
           </w:tcPr>
           <w:p>
-            <w:pPr>
-              <w:spacing w:after="40"/>
-            </w:pPr>
             <w:r>
-              <w:t>Zdj?cie jest notatk? albo mapk?, nie dla inwestora</w:t>
+              <w:t>Zdjęcie jest notatką albo mapką, nie dla inwestora</w:t>
             </w:r>
           </w:p>
         </w:tc>
@@ -908,11 +861,8 @@
             <w:vAlign w:val="center"/>
           </w:tcPr>
           <w:p>
-            <w:pPr>
-              <w:spacing w:after="40"/>
-            </w:pPr>
             <w:r>
-              <w:t>W Review odznacz zdj?cie albo odrzu? ca?? paczk?.</w:t>
+              <w:t>W Review odznacz zdjęcie albo odrzuć całą paczkę.</w:t>
             </w:r>
           </w:p>
         </w:tc>
@@ -921,10 +871,9 @@
     <w:p>
       <w:pPr>
         <w:pStyle w:val="Heading1"/>
-        <w:spacing w:before="200" w:after="100"/>
       </w:pPr>
       <w:r>
-        <w:t>11. Prosta kolejno?? pracy</w:t>
+        <w:t>11. Prosta kolejność pracy</w:t>
       </w:r>
     </w:p>
     <w:p>
@@ -932,7 +881,7 @@
         <w:pStyle w:val="ListNumber"/>
       </w:pPr>
       <w:r>
-        <w:t>Utw?rz projekt z pliku GPKG.</w:t>
+        <w:t>Utwórz projekt z pliku GPKG.</w:t>
       </w:r>
     </w:p>
     <w:p>
@@ -940,7 +889,7 @@
         <w:pStyle w:val="ListNumber"/>
       </w:pPr>
       <w:r>
-        <w:t>Wybierz albo utw?rz folder zapisu zdj?? na dysku udost?pnionym.</w:t>
+        <w:t>Wybierz albo utwórz folder zapisu zdjęć na dysku udostępnionym.</w:t>
       </w:r>
     </w:p>
     <w:p>
@@ -948,7 +897,7 @@
         <w:pStyle w:val="ListNumber"/>
       </w:pPr>
       <w:r>
-        <w:t>Wejd? do Import z Google Chat.</w:t>
+        <w:t>Wejdź do Import z Google Chat.</w:t>
       </w:r>
     </w:p>
     <w:p>
@@ -956,7 +905,7 @@
         <w:pStyle w:val="ListNumber"/>
       </w:pPr>
       <w:r>
-        <w:t>Sprawd? sesj? Google Chat i wybierz pok?j.</w:t>
+        <w:t>Sprawdź sesję Google Chat i wybierz pokój.</w:t>
       </w:r>
     </w:p>
     <w:p>
@@ -964,7 +913,7 @@
         <w:pStyle w:val="ListNumber"/>
       </w:pPr>
       <w:r>
-        <w:t>Pobierz zdj?cia.</w:t>
+        <w:t>Pobierz zdjęcia.</w:t>
       </w:r>
     </w:p>
     <w:p>
@@ -1004,7 +953,7 @@
         <w:pStyle w:val="ListNumber"/>
       </w:pPr>
       <w:r>
-        <w:t>Sprawd? Braki.</w:t>
+        <w:t>Sprawdź Braki.</w:t>
       </w:r>
     </w:p>
     <w:p>
@@ -1018,7 +967,6 @@
     <w:tbl>
       <w:tblPr>
         <w:tblW w:type="auto" w:w="0"/>
-        <w:tblLayout w:type="autofit"/>
         <w:tblLook w:firstColumn="1" w:firstRow="1" w:lastColumn="0" w:lastRow="0" w:noHBand="0" w:noVBand="1" w:val="04A0"/>
       </w:tblPr>
       <w:tblGrid>
@@ -1036,11 +984,11 @@
                 <w:b/>
                 <w:color w:val="2563EB"/>
               </w:rPr>
-              <w:t>Najwa?niejsza zasada ko?cowa</w:t>
+              <w:t>Najważniejsza zasada końcowa</w:t>
             </w:r>
             <w:r>
               <w:br/>
-              <w:t>Photo Local ma by? ?r?d?em prawdy: je?li zdj?cie jest poprawnie przypisane w aplikacji, to uznajemy je za obecne w projekcie. Je?li czego? nie ma w aplikacji albo jest w Review, temat wymaga sprawdzenia.</w:t>
+              <w:t>Photo Local ma być źródłem prawdy: jeśli zdjęcie jest poprawnie przypisane w aplikacji, to uznajemy je za obecne w projekcie. Jeśli czegoś nie ma w aplikacji albo jest w Review, temat wymaga sprawdzenia.</w:t>
             </w:r>
           </w:p>
         </w:tc>

</xml_diff>